<commit_message>
docs: add safe SEIUE token retrieval guide
</commit_message>
<xml_diff>
--- a/jackyun-portal/docs/SEIUE-Schedule-3.39.0-20261023.docx
+++ b/jackyun-portal/docs/SEIUE-Schedule-3.39.0-20261023.docx
@@ -1552,6 +1552,66 @@
     <w:p>
       <w:pPr>
         <w:pStyle w:val="Heading1"/>
+      </w:pPr>
+      <w:r>
+        <w:t>8. 学生如何安全获取 Token</w:t>
+      </w:r>
+    </w:p>
+    <w:p>
+      <w:pPr/>
+      <w:r>
+        <w:t>目前需由学生在已登录的 SEIUE 学校网站中取得短期 Bearer Token；JackYun 不替用户登录。学校界面和浏览器开发者工具显示可能因浏览器版本不同而略有差异。</w:t>
+      </w:r>
+    </w:p>
+    <w:p>
+      <w:pPr>
+        <w:pStyle w:val="ListNumber"/>
+      </w:pPr>
+      <w:r>
+        <w:t>在新标签页正常登录自己的 SEIUE 学校网站并打开个人课表。</w:t>
+      </w:r>
+    </w:p>
+    <w:p>
+      <w:pPr>
+        <w:pStyle w:val="ListNumber"/>
+      </w:pPr>
+      <w:r>
+        <w:t>按 F12 打开开发者工具，选 Network（网络），刷新课表；筛选 api.seiue.com，打开一条状态 200、GET 路径包含 /chalk/calendar/personals/…/events 的请求。</w:t>
+      </w:r>
+    </w:p>
+    <w:p>
+      <w:pPr>
+        <w:pStyle w:val="ListNumber"/>
+      </w:pPr>
+      <w:r>
+        <w:t>在 Request Headers 中只抄取 Authorization 的 Bearer 后半段、X-Reflection-Id 和 X-School-Id。学校网址填写地址栏里的学校 SEIUE 前端网址；学生角色由 JackYun 自动指定。</w:t>
+      </w:r>
+    </w:p>
+    <w:p>
+      <w:pPr>
+        <w:pStyle w:val="ListNumber"/>
+      </w:pPr>
+      <w:r>
+        <w:t>只把上述三个值分别贴进 JackYun 的 Token、Reflection ID、School ID 字段。不要导出 HAR、使用“复制为 cURL”、复制全部请求标头或把请求截图/内容贴进聊天。</w:t>
+      </w:r>
+    </w:p>
+    <w:p>
+      <w:pPr>
+        <w:pStyle w:val="ListNumber"/>
+      </w:pPr>
+      <w:r>
+        <w:t>Token 最长保存 24 小时。到期后在仍登录的 SEIUE 页面重新选取一条成功请求，复制新的 Bearer 值并在 JackYun 账户关联中续期。</w:t>
+      </w:r>
+    </w:p>
+    <w:p>
+      <w:pPr/>
+      <w:r>
+        <w:t>自动获取与自动续期仍关闭：研究未发现官方 refresh token；登录换取 Token 的流程需向 SEIUE Passport 提交学校密码。让 JackYun 接收密码或浏览器 Cookie 会扩大凭据暴露面，因此当前只采用用户在浏览器中自行取得短期 Token 的方式。</w:t>
+      </w:r>
+    </w:p>
+    <w:p>
+      <w:pPr>
+        <w:pStyle w:val="Heading1"/>
         <w:keepNext/>
         <w:spacing w:before="220" w:after="80"/>
       </w:pPr>

</xml_diff>